<commit_message>
Clarify AI Studio template conversion
</commit_message>
<xml_diff>
--- a/.opencode/skills/AIU_Studio_Skill_Explanation_Table.docx
+++ b/.opencode/skills/AIU_Studio_Skill_Explanation_Table.docx
@@ -327,7 +327,7 @@
           </w:tcPr>
           <w:p>
             <w:r>
-              <w:t>runtest_2.py를 생성하고 템플릿을 선택 모델 기준으로 변환</w:t>
+              <w:t>템플릿 복사 후 복사된 템플릿 기준으로 선택 모델 경로와 모델 형식 연결부를 수정</w:t>
             </w:r>
           </w:p>
         </w:tc>
@@ -800,7 +800,7 @@
           </w:tcPr>
           <w:p>
             <w:r>
-              <w:t>템플릿 복사 + 선택 모델 기준 코드 변환</w:t>
+              <w:t>템플릿 복사 + 복사된 템플릿 기준 연결부 수정</w:t>
             </w:r>
           </w:p>
         </w:tc>
@@ -1075,7 +1075,7 @@
           </w:tcPr>
           <w:p>
             <w:r>
-              <w:t>템플릿 복사와 코드 변환</w:t>
+              <w:t>템플릿 복사와 연결부 수정</w:t>
             </w:r>
           </w:p>
         </w:tc>

</xml_diff>